<commit_message>
fix(report): add title page and work schedule
</commit_message>
<xml_diff>
--- a/report/Отчет_ИКБО-10-24_ПавловаАА_КТ1.docx
+++ b/report/Отчет_ИКБО-10-24_ПавловаАА_КТ1.docx
@@ -11,11 +11,355 @@
         </w:rPr>
       </w:pPr>
       <w:bookmarkStart w:id="0" w:name="_GoBack"/>
-      <w:bookmarkEnd w:id="0"/>
-      <w:r>
-        <w:rPr>
-          <w:lang w:val="ru-RU"/>
-        </w:rPr>
+      <w:r>
+        <w:drawing>
+          <wp:inline distT="0" distB="0" distL="0" distR="0" wp14:anchorId="4056CF42" wp14:editId="32D482FD">
+            <wp:extent cx="6299200" cy="8648700"/>
+            <wp:effectExtent l="0" t="0" r="6350" b="0"/>
+            <wp:docPr id="7" name="Рисунок 7"/>
+            <wp:cNvGraphicFramePr>
+              <a:graphicFrameLocks xmlns:a="http://schemas.openxmlformats.org/drawingml/2006/main" noChangeAspect="1"/>
+            </wp:cNvGraphicFramePr>
+            <a:graphic xmlns:a="http://schemas.openxmlformats.org/drawingml/2006/main">
+              <a:graphicData uri="http://schemas.openxmlformats.org/drawingml/2006/picture">
+                <pic:pic xmlns:pic="http://schemas.openxmlformats.org/drawingml/2006/picture">
+                  <pic:nvPicPr>
+                    <pic:cNvPr id="0" name="Picture 27"/>
+                    <pic:cNvPicPr>
+                      <a:picLocks noChangeAspect="1" noChangeArrowheads="1"/>
+                    </pic:cNvPicPr>
+                  </pic:nvPicPr>
+                  <pic:blipFill>
+                    <a:blip r:embed="rId8">
+                      <a:extLst>
+                        <a:ext uri="{28A0092B-C50C-407E-A947-70E740481C1C}">
+                          <a14:useLocalDpi xmlns:a14="http://schemas.microsoft.com/office/drawing/2010/main" val="0"/>
+                        </a:ext>
+                      </a:extLst>
+                    </a:blip>
+                    <a:srcRect/>
+                    <a:stretch>
+                      <a:fillRect/>
+                    </a:stretch>
+                  </pic:blipFill>
+                  <pic:spPr bwMode="auto">
+                    <a:xfrm>
+                      <a:off x="0" y="0"/>
+                      <a:ext cx="6299200" cy="8648700"/>
+                    </a:xfrm>
+                    <a:prstGeom prst="rect">
+                      <a:avLst/>
+                    </a:prstGeom>
+                    <a:noFill/>
+                    <a:ln>
+                      <a:noFill/>
+                    </a:ln>
+                  </pic:spPr>
+                </pic:pic>
+              </a:graphicData>
+            </a:graphic>
+          </wp:inline>
+        </w:drawing>
+      </w:r>
+      <w:r>
+        <w:t xml:space="preserve"> </w:t>
+      </w:r>
+      <w:r>
+        <w:rPr>
+          <w:lang w:val="ru-RU"/>
+        </w:rPr>
+        <w:br w:type="page"/>
+      </w:r>
+    </w:p>
+    <w:p>
+      <w:pPr>
+        <w:pStyle w:val="aff"/>
+        <w:jc w:val="center"/>
+        <w:rPr>
+          <w:lang w:val="ru-RU"/>
+        </w:rPr>
+      </w:pPr>
+      <w:r>
+        <w:lastRenderedPageBreak/>
+        <w:drawing>
+          <wp:inline distT="0" distB="0" distL="0" distR="0" wp14:anchorId="5286CD9E" wp14:editId="55B8A723">
+            <wp:extent cx="6299200" cy="8864600"/>
+            <wp:effectExtent l="0" t="0" r="6350" b="0"/>
+            <wp:docPr id="8" name="Рисунок 8"/>
+            <wp:cNvGraphicFramePr>
+              <a:graphicFrameLocks xmlns:a="http://schemas.openxmlformats.org/drawingml/2006/main" noChangeAspect="1"/>
+            </wp:cNvGraphicFramePr>
+            <a:graphic xmlns:a="http://schemas.openxmlformats.org/drawingml/2006/main">
+              <a:graphicData uri="http://schemas.openxmlformats.org/drawingml/2006/picture">
+                <pic:pic xmlns:pic="http://schemas.openxmlformats.org/drawingml/2006/picture">
+                  <pic:nvPicPr>
+                    <pic:cNvPr id="0" name="Picture 28"/>
+                    <pic:cNvPicPr>
+                      <a:picLocks noChangeAspect="1" noChangeArrowheads="1"/>
+                    </pic:cNvPicPr>
+                  </pic:nvPicPr>
+                  <pic:blipFill>
+                    <a:blip r:embed="rId9">
+                      <a:extLst>
+                        <a:ext uri="{28A0092B-C50C-407E-A947-70E740481C1C}">
+                          <a14:useLocalDpi xmlns:a14="http://schemas.microsoft.com/office/drawing/2010/main" val="0"/>
+                        </a:ext>
+                      </a:extLst>
+                    </a:blip>
+                    <a:srcRect/>
+                    <a:stretch>
+                      <a:fillRect/>
+                    </a:stretch>
+                  </pic:blipFill>
+                  <pic:spPr bwMode="auto">
+                    <a:xfrm>
+                      <a:off x="0" y="0"/>
+                      <a:ext cx="6299200" cy="8864600"/>
+                    </a:xfrm>
+                    <a:prstGeom prst="rect">
+                      <a:avLst/>
+                    </a:prstGeom>
+                    <a:noFill/>
+                    <a:ln>
+                      <a:noFill/>
+                    </a:ln>
+                  </pic:spPr>
+                </pic:pic>
+              </a:graphicData>
+            </a:graphic>
+          </wp:inline>
+        </w:drawing>
+      </w:r>
+      <w:r>
+        <w:t xml:space="preserve"> </w:t>
+      </w:r>
+      <w:r>
+        <w:rPr>
+          <w:lang w:val="ru-RU"/>
+        </w:rPr>
+        <w:br w:type="page"/>
+      </w:r>
+    </w:p>
+    <w:p>
+      <w:pPr>
+        <w:pStyle w:val="aff"/>
+        <w:jc w:val="center"/>
+        <w:rPr>
+          <w:lang w:val="ru-RU"/>
+        </w:rPr>
+      </w:pPr>
+      <w:r>
+        <w:lastRenderedPageBreak/>
+        <w:drawing>
+          <wp:inline distT="0" distB="0" distL="0" distR="0" wp14:anchorId="1834223C" wp14:editId="6629C716">
+            <wp:extent cx="6299200" cy="9004300"/>
+            <wp:effectExtent l="0" t="0" r="6350" b="0"/>
+            <wp:docPr id="9" name="Рисунок 9"/>
+            <wp:cNvGraphicFramePr>
+              <a:graphicFrameLocks xmlns:a="http://schemas.openxmlformats.org/drawingml/2006/main" noChangeAspect="1"/>
+            </wp:cNvGraphicFramePr>
+            <a:graphic xmlns:a="http://schemas.openxmlformats.org/drawingml/2006/main">
+              <a:graphicData uri="http://schemas.openxmlformats.org/drawingml/2006/picture">
+                <pic:pic xmlns:pic="http://schemas.openxmlformats.org/drawingml/2006/picture">
+                  <pic:nvPicPr>
+                    <pic:cNvPr id="0" name="Picture 29"/>
+                    <pic:cNvPicPr>
+                      <a:picLocks noChangeAspect="1" noChangeArrowheads="1"/>
+                    </pic:cNvPicPr>
+                  </pic:nvPicPr>
+                  <pic:blipFill>
+                    <a:blip r:embed="rId10">
+                      <a:extLst>
+                        <a:ext uri="{28A0092B-C50C-407E-A947-70E740481C1C}">
+                          <a14:useLocalDpi xmlns:a14="http://schemas.microsoft.com/office/drawing/2010/main" val="0"/>
+                        </a:ext>
+                      </a:extLst>
+                    </a:blip>
+                    <a:srcRect/>
+                    <a:stretch>
+                      <a:fillRect/>
+                    </a:stretch>
+                  </pic:blipFill>
+                  <pic:spPr bwMode="auto">
+                    <a:xfrm>
+                      <a:off x="0" y="0"/>
+                      <a:ext cx="6299200" cy="9004300"/>
+                    </a:xfrm>
+                    <a:prstGeom prst="rect">
+                      <a:avLst/>
+                    </a:prstGeom>
+                    <a:noFill/>
+                    <a:ln>
+                      <a:noFill/>
+                    </a:ln>
+                  </pic:spPr>
+                </pic:pic>
+              </a:graphicData>
+            </a:graphic>
+          </wp:inline>
+        </w:drawing>
+      </w:r>
+      <w:r>
+        <w:t xml:space="preserve"> </w:t>
+      </w:r>
+      <w:r>
+        <w:rPr>
+          <w:lang w:val="ru-RU"/>
+        </w:rPr>
+        <w:br w:type="page"/>
+      </w:r>
+    </w:p>
+    <w:p>
+      <w:pPr>
+        <w:pStyle w:val="aff"/>
+        <w:jc w:val="center"/>
+        <w:rPr>
+          <w:lang w:val="ru-RU"/>
+        </w:rPr>
+      </w:pPr>
+      <w:r>
+        <w:lastRenderedPageBreak/>
+        <w:drawing>
+          <wp:inline distT="0" distB="0" distL="0" distR="0" wp14:anchorId="2172F4E6" wp14:editId="618A7F69">
+            <wp:extent cx="6299200" cy="9105900"/>
+            <wp:effectExtent l="0" t="0" r="6350" b="0"/>
+            <wp:docPr id="10" name="Рисунок 10"/>
+            <wp:cNvGraphicFramePr>
+              <a:graphicFrameLocks xmlns:a="http://schemas.openxmlformats.org/drawingml/2006/main" noChangeAspect="1"/>
+            </wp:cNvGraphicFramePr>
+            <a:graphic xmlns:a="http://schemas.openxmlformats.org/drawingml/2006/main">
+              <a:graphicData uri="http://schemas.openxmlformats.org/drawingml/2006/picture">
+                <pic:pic xmlns:pic="http://schemas.openxmlformats.org/drawingml/2006/picture">
+                  <pic:nvPicPr>
+                    <pic:cNvPr id="0" name="Picture 30"/>
+                    <pic:cNvPicPr>
+                      <a:picLocks noChangeAspect="1" noChangeArrowheads="1"/>
+                    </pic:cNvPicPr>
+                  </pic:nvPicPr>
+                  <pic:blipFill>
+                    <a:blip r:embed="rId11">
+                      <a:extLst>
+                        <a:ext uri="{28A0092B-C50C-407E-A947-70E740481C1C}">
+                          <a14:useLocalDpi xmlns:a14="http://schemas.microsoft.com/office/drawing/2010/main" val="0"/>
+                        </a:ext>
+                      </a:extLst>
+                    </a:blip>
+                    <a:srcRect/>
+                    <a:stretch>
+                      <a:fillRect/>
+                    </a:stretch>
+                  </pic:blipFill>
+                  <pic:spPr bwMode="auto">
+                    <a:xfrm>
+                      <a:off x="0" y="0"/>
+                      <a:ext cx="6299200" cy="9105900"/>
+                    </a:xfrm>
+                    <a:prstGeom prst="rect">
+                      <a:avLst/>
+                    </a:prstGeom>
+                    <a:noFill/>
+                    <a:ln>
+                      <a:noFill/>
+                    </a:ln>
+                  </pic:spPr>
+                </pic:pic>
+              </a:graphicData>
+            </a:graphic>
+          </wp:inline>
+        </w:drawing>
+      </w:r>
+      <w:r>
+        <w:t xml:space="preserve"> </w:t>
+      </w:r>
+      <w:r>
+        <w:rPr>
+          <w:lang w:val="ru-RU"/>
+        </w:rPr>
+        <w:br w:type="page"/>
+      </w:r>
+    </w:p>
+    <w:p>
+      <w:pPr>
+        <w:pStyle w:val="aff"/>
+        <w:jc w:val="center"/>
+        <w:rPr>
+          <w:lang w:val="ru-RU"/>
+        </w:rPr>
+      </w:pPr>
+      <w:r>
+        <w:lastRenderedPageBreak/>
+        <w:drawing>
+          <wp:inline distT="0" distB="0" distL="0" distR="0" wp14:anchorId="2BB8D226" wp14:editId="00C05012">
+            <wp:extent cx="6299200" cy="9232900"/>
+            <wp:effectExtent l="0" t="0" r="6350" b="0"/>
+            <wp:docPr id="11" name="Рисунок 11"/>
+            <wp:cNvGraphicFramePr>
+              <a:graphicFrameLocks xmlns:a="http://schemas.openxmlformats.org/drawingml/2006/main" noChangeAspect="1"/>
+            </wp:cNvGraphicFramePr>
+            <a:graphic xmlns:a="http://schemas.openxmlformats.org/drawingml/2006/main">
+              <a:graphicData uri="http://schemas.openxmlformats.org/drawingml/2006/picture">
+                <pic:pic xmlns:pic="http://schemas.openxmlformats.org/drawingml/2006/picture">
+                  <pic:nvPicPr>
+                    <pic:cNvPr id="0" name="Picture 31"/>
+                    <pic:cNvPicPr>
+                      <a:picLocks noChangeAspect="1" noChangeArrowheads="1"/>
+                    </pic:cNvPicPr>
+                  </pic:nvPicPr>
+                  <pic:blipFill>
+                    <a:blip r:embed="rId12">
+                      <a:extLst>
+                        <a:ext uri="{28A0092B-C50C-407E-A947-70E740481C1C}">
+                          <a14:useLocalDpi xmlns:a14="http://schemas.microsoft.com/office/drawing/2010/main" val="0"/>
+                        </a:ext>
+                      </a:extLst>
+                    </a:blip>
+                    <a:srcRect/>
+                    <a:stretch>
+                      <a:fillRect/>
+                    </a:stretch>
+                  </pic:blipFill>
+                  <pic:spPr bwMode="auto">
+                    <a:xfrm>
+                      <a:off x="0" y="0"/>
+                      <a:ext cx="6299200" cy="9232900"/>
+                    </a:xfrm>
+                    <a:prstGeom prst="rect">
+                      <a:avLst/>
+                    </a:prstGeom>
+                    <a:noFill/>
+                    <a:ln>
+                      <a:noFill/>
+                    </a:ln>
+                  </pic:spPr>
+                </pic:pic>
+              </a:graphicData>
+            </a:graphic>
+          </wp:inline>
+        </w:drawing>
+      </w:r>
+      <w:r>
+        <w:t xml:space="preserve"> </w:t>
+      </w:r>
+      <w:r>
+        <w:rPr>
+          <w:lang w:val="ru-RU"/>
+        </w:rPr>
+        <w:br w:type="page"/>
+      </w:r>
+    </w:p>
+    <w:p>
+      <w:pPr>
+        <w:pStyle w:val="aff"/>
+        <w:jc w:val="center"/>
+        <w:rPr>
+          <w:lang w:val="ru-RU"/>
+        </w:rPr>
+      </w:pPr>
+      <w:r>
+        <w:rPr>
+          <w:lang w:val="ru-RU"/>
+        </w:rPr>
+        <w:lastRenderedPageBreak/>
         <w:t>СОДЕРЖАНИЕ</w:t>
       </w:r>
     </w:p>
@@ -177,7 +521,7 @@
           <w:noProof/>
           <w:lang w:val="ru-RU"/>
         </w:rPr>
-        <w:t>3</w:t>
+        <w:t>2</w:t>
       </w:r>
       <w:r>
         <w:rPr>
@@ -276,7 +620,7 @@
           <w:noProof/>
           <w:lang w:val="ru-RU"/>
         </w:rPr>
-        <w:t>5</w:t>
+        <w:t>4</w:t>
       </w:r>
       <w:r>
         <w:rPr>
@@ -375,7 +719,7 @@
           <w:noProof/>
           <w:lang w:val="ru-RU"/>
         </w:rPr>
-        <w:t>5</w:t>
+        <w:t>4</w:t>
       </w:r>
       <w:r>
         <w:rPr>
@@ -487,7 +831,7 @@
           <w:noProof/>
           <w:lang w:val="ru-RU"/>
         </w:rPr>
-        <w:t>6</w:t>
+        <w:t>5</w:t>
       </w:r>
       <w:r>
         <w:rPr>
@@ -586,7 +930,7 @@
           <w:noProof/>
           <w:lang w:val="ru-RU"/>
         </w:rPr>
-        <w:t>7</w:t>
+        <w:t>6</w:t>
       </w:r>
       <w:r>
         <w:rPr>
@@ -685,7 +1029,7 @@
           <w:noProof/>
           <w:lang w:val="ru-RU"/>
         </w:rPr>
-        <w:t>9</w:t>
+        <w:t>8</w:t>
       </w:r>
       <w:r>
         <w:rPr>
@@ -784,7 +1128,7 @@
           <w:noProof/>
           <w:lang w:val="ru-RU"/>
         </w:rPr>
-        <w:t>11</w:t>
+        <w:t>10</w:t>
       </w:r>
       <w:r>
         <w:rPr>
@@ -883,7 +1227,7 @@
           <w:noProof/>
           <w:lang w:val="ru-RU"/>
         </w:rPr>
-        <w:t>15</w:t>
+        <w:t>14</w:t>
       </w:r>
       <w:r>
         <w:rPr>
@@ -982,7 +1326,7 @@
           <w:noProof/>
           <w:lang w:val="ru-RU"/>
         </w:rPr>
-        <w:t>17</w:t>
+        <w:t>16</w:t>
       </w:r>
       <w:r>
         <w:rPr>
@@ -1081,7 +1425,7 @@
           <w:noProof/>
           <w:lang w:val="ru-RU"/>
         </w:rPr>
-        <w:t>19</w:t>
+        <w:t>18</w:t>
       </w:r>
       <w:r>
         <w:rPr>
@@ -1178,9 +1522,8 @@
       <w:r>
         <w:rPr>
           <w:noProof/>
-          <w:lang w:val="ru-RU"/>
-        </w:rPr>
-        <w:t>22</w:t>
+        </w:rPr>
+        <w:t>21</w:t>
       </w:r>
       <w:r>
         <w:rPr>
@@ -6098,9 +6441,10 @@
         </w:rPr>
         <w:t>в настоящей учебной работе.</w:t>
       </w:r>
+      <w:bookmarkEnd w:id="0"/>
     </w:p>
     <w:sectPr>
-      <w:footerReference w:type="default" r:id="rId8"/>
+      <w:footerReference w:type="default" r:id="rId13"/>
       <w:pgSz w:w="11906" w:h="16838"/>
       <w:pgMar w:top="1134" w:right="567" w:bottom="1134" w:left="1701" w:header="567" w:footer="567" w:gutter="0"/>
       <w:cols w:space="720"/>
@@ -18175,7 +18519,7 @@
 </file>
 
 <file path=customXml/itemProps1.xml><?xml version="1.0" encoding="utf-8"?>
-<ds:datastoreItem xmlns:ds="http://schemas.openxmlformats.org/officeDocument/2006/customXml" ds:itemID="{A2D505E1-DB8B-45BE-855A-65A2C95759ED}">
+<ds:datastoreItem xmlns:ds="http://schemas.openxmlformats.org/officeDocument/2006/customXml" ds:itemID="{E764C692-5C95-424D-85EA-9BE8BFE5E2D4}">
   <ds:schemaRefs>
     <ds:schemaRef ds:uri="http://schemas.openxmlformats.org/officeDocument/2006/bibliography"/>
   </ds:schemaRefs>

</xml_diff>